<commit_message>
Update icons, manifest, English audio fix; ignore pack-only audio
</commit_message>
<xml_diff>
--- a/App Store Listing — Jugalbandhi Self.docx
+++ b/App Store Listing — Jugalbandhi Self.docx
@@ -4,45 +4,380 @@
   <w:body>
     <w:p>
       <w:pPr>
-        <w:spacing w:before="1200" w:after="160"/>
         <w:jc w:val="center"/>
       </w:pPr>
       <w:r>
         <w:rPr>
-          <w:rFonts w:ascii="Arial" w:hAnsi="Arial"/>
           <w:b/>
-          <w:color w:val="1A1008"/>
-          <w:sz w:val="52"/>
+          <w:color w:val="1A568E"/>
+          <w:sz w:val="56"/>
         </w:rPr>
         <w:t>Jugalbandhi Self</w:t>
       </w:r>
     </w:p>
     <w:p>
       <w:pPr>
-        <w:spacing w:after="80"/>
         <w:jc w:val="center"/>
       </w:pPr>
       <w:r>
         <w:rPr>
-          <w:rFonts w:ascii="Arial" w:hAnsi="Arial"/>
-          <w:color w:val="C9952A"/>
-          <w:sz w:val="22"/>
+          <w:color w:val="666666"/>
+          <w:sz w:val="28"/>
         </w:rPr>
-        <w:t>App Store &amp; Google Play — Listing Copy</w:t>
+        <w:t>App Store &amp; Google Play — Store Listing (Final)</w:t>
       </w:r>
     </w:p>
     <w:p>
       <w:pPr>
-        <w:spacing w:after="1200"/>
         <w:jc w:val="center"/>
       </w:pPr>
       <w:r>
         <w:rPr>
-          <w:rFonts w:ascii="Arial" w:hAnsi="Arial"/>
-          <w:color w:val="998877"/>
+          <w:color w:val="999999"/>
+          <w:sz w:val="22"/>
+        </w:rPr>
+        <w:t>Rahil Mundkur · April 2026 · Price: $6.99 USD</w:t>
+      </w:r>
+    </w:p>
+    <w:p/>
+    <w:p>
+      <w:pPr>
+        <w:pStyle w:val="Heading1"/>
+      </w:pPr>
+      <w:r>
+        <w:t>Apple App Store</w:t>
+      </w:r>
+    </w:p>
+    <w:p>
+      <w:r>
+        <w:rPr>
+          <w:i/>
+          <w:color w:val="888888"/>
+          <w:sz w:val="20"/>
+        </w:rPr>
+        <w:t>Character limits are enforced by App Store Connect. Copy each field exactly as shown.</w:t>
+      </w:r>
+    </w:p>
+    <w:p>
+      <w:pPr>
+        <w:pStyle w:val="Heading3"/>
+      </w:pPr>
+      <w:r>
+        <w:t>Name</w:t>
+      </w:r>
+    </w:p>
+    <w:p>
+      <w:r>
+        <w:rPr>
+          <w:b/>
+          <w:sz w:val="22"/>
+        </w:rPr>
+        <w:t xml:space="preserve">Text: </w:t>
+      </w:r>
+      <w:r>
+        <w:rPr>
+          <w:sz w:val="22"/>
+        </w:rPr>
+        <w:t>Jugalbandhi Self</w:t>
+      </w:r>
+      <w:r>
+        <w:rPr>
+          <w:color w:val="888888"/>
           <w:sz w:val="18"/>
         </w:rPr>
-        <w:t>Rahil Mundkur  ·  March 2026</w:t>
+        <w:t xml:space="preserve">  (16 of 30 chars)</w:t>
+      </w:r>
+    </w:p>
+    <w:p>
+      <w:pPr>
+        <w:pStyle w:val="Heading3"/>
+      </w:pPr>
+      <w:r>
+        <w:t>Subtitle</w:t>
+      </w:r>
+    </w:p>
+    <w:p>
+      <w:r>
+        <w:rPr>
+          <w:b/>
+          <w:sz w:val="22"/>
+        </w:rPr>
+        <w:t xml:space="preserve">Text: </w:t>
+      </w:r>
+      <w:r>
+        <w:rPr>
+          <w:sz w:val="22"/>
+        </w:rPr>
+        <w:t>The Self, in 35 Languages</w:t>
+      </w:r>
+      <w:r>
+        <w:rPr>
+          <w:color w:val="888888"/>
+          <w:sz w:val="18"/>
+        </w:rPr>
+        <w:t xml:space="preserve">  (26 of 30 chars)</w:t>
+      </w:r>
+    </w:p>
+    <w:p>
+      <w:pPr>
+        <w:pStyle w:val="Heading3"/>
+      </w:pPr>
+      <w:r>
+        <w:t>Category</w:t>
+      </w:r>
+    </w:p>
+    <w:p>
+      <w:r>
+        <w:rPr>
+          <w:b/>
+          <w:sz w:val="22"/>
+        </w:rPr>
+        <w:t xml:space="preserve">Primary: </w:t>
+      </w:r>
+      <w:r>
+        <w:rPr>
+          <w:sz w:val="22"/>
+        </w:rPr>
+        <w:t>Books</w:t>
+      </w:r>
+    </w:p>
+    <w:p>
+      <w:r>
+        <w:rPr>
+          <w:b/>
+          <w:sz w:val="22"/>
+        </w:rPr>
+        <w:t xml:space="preserve">Secondary: </w:t>
+      </w:r>
+      <w:r>
+        <w:rPr>
+          <w:sz w:val="22"/>
+        </w:rPr>
+        <w:t>Education</w:t>
+      </w:r>
+    </w:p>
+    <w:p>
+      <w:pPr>
+        <w:pStyle w:val="Heading3"/>
+      </w:pPr>
+      <w:r>
+        <w:t>Price</w:t>
+      </w:r>
+    </w:p>
+    <w:p>
+      <w:r>
+        <w:rPr>
+          <w:b/>
+          <w:sz w:val="22"/>
+        </w:rPr>
+        <w:t xml:space="preserve">Price Tier: </w:t>
+      </w:r>
+      <w:r>
+        <w:rPr>
+          <w:sz w:val="22"/>
+        </w:rPr>
+        <w:t>$6.99 USD</w:t>
+      </w:r>
+      <w:r>
+        <w:rPr>
+          <w:color w:val="888888"/>
+          <w:sz w:val="18"/>
+        </w:rPr>
+        <w:t xml:space="preserve">  (Set in App Store Connect &gt; Pricing and Availability)</w:t>
+      </w:r>
+    </w:p>
+    <w:p>
+      <w:pPr>
+        <w:pStyle w:val="Heading3"/>
+      </w:pPr>
+      <w:r>
+        <w:t>Description</w:t>
+      </w:r>
+    </w:p>
+    <w:p>
+      <w:r>
+        <w:rPr>
+          <w:color w:val="888888"/>
+          <w:sz w:val="20"/>
+        </w:rPr>
+        <w:t>4,000 characters max. Copy the text below:</w:t>
+      </w:r>
+    </w:p>
+    <w:p>
+      <w:pPr>
+        <w:ind w:left="432"/>
+        <w:shd w:val="clear" w:color="auto" w:fill="F5F5F0"/>
+      </w:pPr>
+      <w:r>
+        <w:rPr>
+          <w:color w:val="222222"/>
+          <w:sz w:val="20"/>
+        </w:rPr>
+        <w:t>Jugalbandhi Self is a beautifully crafted digital edition of Rahil Mundkur's philosophical exploration of the nature of the Self — drawing on the ancient wisdom of Vedanta and Advaita philosophy.</w:t>
+        <w:br/>
+        <w:br/>
+        <w:t>The word jugalbandhi describes a duet in Indian classical music: two voices, one resonance. This book brings the perennial question "Who am I?" into conversation with the modern mind.</w:t>
+        <w:br/>
+        <w:br/>
+        <w:t>FEATURES</w:t>
+        <w:br/>
+        <w:t>· Read the full text in 35 languages, including Sanskrit, Hindi, Tamil, Telugu, Arabic, Japanese, Chinese, and more</w:t>
+        <w:br/>
+        <w:t>· Listen to the book with built-in audio narration in English, Hindi, and French</w:t>
+        <w:br/>
+        <w:t>· Fully offline — all translations and audio embedded, no internet required</w:t>
+        <w:br/>
+        <w:t>· Side-by-side bilingual reading mode</w:t>
+        <w:br/>
+        <w:t>· Bookmarks and personal notes for each chapter</w:t>
+        <w:br/>
+        <w:t>· Full-text search across the entire book</w:t>
+        <w:br/>
+        <w:t>· Adjustable font size, dark mode, and pinch-to-zoom</w:t>
+        <w:br/>
+        <w:t>· 32 chapters across 1 hr 28 min of reading</w:t>
+        <w:br/>
+        <w:br/>
+        <w:t>Whether you approach this book through philosophy, spirituality, or simple curiosity, Jugalbandhi Self invites you to look inward.</w:t>
+        <w:br/>
+        <w:br/>
+        <w:t>No account required. No ads. No data collected.</w:t>
+      </w:r>
+    </w:p>
+    <w:p>
+      <w:pPr>
+        <w:pStyle w:val="Heading3"/>
+      </w:pPr>
+      <w:r>
+        <w:t>Keywords</w:t>
+      </w:r>
+    </w:p>
+    <w:p>
+      <w:r>
+        <w:rPr>
+          <w:b/>
+          <w:sz w:val="22"/>
+        </w:rPr>
+        <w:t xml:space="preserve">Text: </w:t>
+      </w:r>
+      <w:r>
+        <w:rPr>
+          <w:sz w:val="22"/>
+        </w:rPr>
+        <w:t>vedanta,self,consciousness,philosophy,advaita,non-duality,spirituality,meditation,Sanskrit,mindfulness</w:t>
+      </w:r>
+      <w:r>
+        <w:rPr>
+          <w:color w:val="888888"/>
+          <w:sz w:val="18"/>
+        </w:rPr>
+        <w:t xml:space="preserve">  (99 of 100 chars)</w:t>
+      </w:r>
+    </w:p>
+    <w:p>
+      <w:pPr>
+        <w:pStyle w:val="Heading3"/>
+      </w:pPr>
+      <w:r>
+        <w:t>Support URL</w:t>
+      </w:r>
+    </w:p>
+    <w:p>
+      <w:r>
+        <w:rPr>
+          <w:b/>
+          <w:sz w:val="22"/>
+        </w:rPr>
+        <w:t xml:space="preserve">Text: </w:t>
+      </w:r>
+      <w:r>
+        <w:rPr>
+          <w:sz w:val="22"/>
+        </w:rPr>
+        <w:t>mailto:rahilsydney@gmail.com</w:t>
+      </w:r>
+      <w:r>
+        <w:rPr>
+          <w:color w:val="888888"/>
+          <w:sz w:val="18"/>
+        </w:rPr>
+        <w:t xml:space="preserve">  (Or host a simple contact page)</w:t>
+      </w:r>
+    </w:p>
+    <w:p>
+      <w:pPr>
+        <w:pStyle w:val="Heading3"/>
+      </w:pPr>
+      <w:r>
+        <w:t>Privacy Policy URL</w:t>
+      </w:r>
+    </w:p>
+    <w:p>
+      <w:r>
+        <w:rPr>
+          <w:b/>
+          <w:sz w:val="22"/>
+        </w:rPr>
+        <w:t xml:space="preserve">Text: </w:t>
+      </w:r>
+      <w:r>
+        <w:rPr>
+          <w:sz w:val="22"/>
+        </w:rPr>
+        <w:t>https://rahilmundkur.github.io/jugalbandhi-self/privacy-policy.html</w:t>
+      </w:r>
+    </w:p>
+    <w:p>
+      <w:pPr>
+        <w:pStyle w:val="Heading3"/>
+      </w:pPr>
+      <w:r>
+        <w:t>Age Rating</w:t>
+      </w:r>
+    </w:p>
+    <w:p>
+      <w:r>
+        <w:rPr>
+          <w:b/>
+          <w:sz w:val="22"/>
+        </w:rPr>
+        <w:t xml:space="preserve">Rating: </w:t>
+      </w:r>
+      <w:r>
+        <w:rPr>
+          <w:sz w:val="22"/>
+        </w:rPr>
+        <w:t>4+</w:t>
+      </w:r>
+      <w:r>
+        <w:rPr>
+          <w:color w:val="888888"/>
+          <w:sz w:val="18"/>
+        </w:rPr>
+        <w:t xml:space="preserve">  (No objectionable content)</w:t>
+      </w:r>
+    </w:p>
+    <w:p>
+      <w:pPr>
+        <w:pStyle w:val="Heading3"/>
+      </w:pPr>
+      <w:r>
+        <w:t>What's New (Version 1.0)</w:t>
+      </w:r>
+    </w:p>
+    <w:p>
+      <w:r>
+        <w:rPr>
+          <w:b/>
+          <w:sz w:val="22"/>
+        </w:rPr>
+        <w:t xml:space="preserve">Text: </w:t>
+      </w:r>
+      <w:r>
+        <w:rPr>
+          <w:sz w:val="22"/>
+        </w:rPr>
+        <w:t>First release — read Jugalbandhi Self in 35 languages with built-in audio narration.</w:t>
       </w:r>
     </w:p>
     <w:p>
@@ -52,706 +387,192 @@
     </w:p>
     <w:p>
       <w:pPr>
-        <w:spacing w:before="360" w:after="80"/>
+        <w:pStyle w:val="Heading1"/>
       </w:pPr>
       <w:r>
+        <w:t>Google Play Store</w:t>
+      </w:r>
+    </w:p>
+    <w:p>
+      <w:r>
         <w:rPr>
-          <w:rFonts w:ascii="Arial" w:hAnsi="Arial"/>
-          <w:b/>
-          <w:color w:val="1A1008"/>
-          <w:sz w:val="28"/>
+          <w:i/>
+          <w:color w:val="888888"/>
+          <w:sz w:val="20"/>
         </w:rPr>
-        <w:t>Apple App Store</w:t>
+        <w:t>Character limits are enforced by the Play Console. Copy each field exactly as shown.</w:t>
       </w:r>
     </w:p>
     <w:p>
       <w:pPr>
-        <w:spacing w:after="80"/>
+        <w:pStyle w:val="Heading3"/>
       </w:pPr>
       <w:r>
-        <w:rPr>
-          <w:rFonts w:ascii="Arial" w:hAnsi="Arial"/>
-          <w:b w:val="0"/>
-          <w:i/>
-          <w:color w:val="887766"/>
-          <w:sz w:val="20"/>
-        </w:rPr>
-        <w:t>Character limits are enforced by App Store Connect.</w:t>
+        <w:t>App Name</w:t>
       </w:r>
     </w:p>
     <w:p>
-      <w:pPr>
-        <w:spacing w:before="120" w:after="120"/>
-        <w:pBdr>
-          <w:bottom w:val="single" w:sz="4" w:space="1" w:color="E8E0D0"/>
-        </w:pBdr>
-      </w:pPr>
-    </w:p>
-    <w:p>
-      <w:pPr>
-        <w:spacing w:before="200" w:after="80"/>
-      </w:pPr>
       <w:r>
         <w:rPr>
-          <w:rFonts w:ascii="Arial" w:hAnsi="Arial"/>
           <w:b/>
-          <w:color w:val="C9952A"/>
-          <w:sz w:val="20"/>
+          <w:sz w:val="22"/>
         </w:rPr>
-        <w:t>Name</w:t>
-      </w:r>
-    </w:p>
-    <w:p>
-      <w:pPr>
-        <w:spacing w:after="40"/>
-      </w:pPr>
-      <w:r>
-        <w:rPr>
-          <w:rFonts w:ascii="Arial" w:hAnsi="Arial"/>
-          <w:b/>
-          <w:sz w:val="20"/>
-        </w:rPr>
-        <w:t xml:space="preserve">Text:  </w:t>
+        <w:t xml:space="preserve">Text: </w:t>
       </w:r>
       <w:r>
         <w:rPr>
-          <w:rFonts w:ascii="Arial" w:hAnsi="Arial"/>
-          <w:sz w:val="20"/>
+          <w:sz w:val="22"/>
         </w:rPr>
         <w:t>Jugalbandhi Self</w:t>
       </w:r>
       <w:r>
         <w:rPr>
-          <w:rFonts w:ascii="Arial" w:hAnsi="Arial"/>
-          <w:color w:val="887766"/>
+          <w:color w:val="888888"/>
           <w:sz w:val="18"/>
         </w:rPr>
-        <w:t xml:space="preserve">  (30 chars max — 16 used)</w:t>
+        <w:t xml:space="preserve">  (16 of 50 chars)</w:t>
       </w:r>
     </w:p>
     <w:p>
       <w:pPr>
-        <w:spacing w:before="200" w:after="80"/>
+        <w:pStyle w:val="Heading3"/>
       </w:pPr>
       <w:r>
+        <w:t>Short Description</w:t>
+      </w:r>
+    </w:p>
+    <w:p>
+      <w:r>
         <w:rPr>
-          <w:rFonts w:ascii="Arial" w:hAnsi="Arial"/>
           <w:b/>
-          <w:color w:val="C9952A"/>
+          <w:sz w:val="22"/>
+        </w:rPr>
+        <w:t xml:space="preserve">Text: </w:t>
+      </w:r>
+      <w:r>
+        <w:rPr>
+          <w:sz w:val="22"/>
+        </w:rPr>
+        <w:t>A philosophical book on the Self with audio narration — available in 35 languages, fully offline.</w:t>
+      </w:r>
+      <w:r>
+        <w:rPr>
+          <w:color w:val="888888"/>
+          <w:sz w:val="18"/>
+        </w:rPr>
+        <w:t xml:space="preserve">  (95 of 80 chars — NEEDS TRIM)</w:t>
+      </w:r>
+    </w:p>
+    <w:p/>
+    <w:p>
+      <w:r>
+        <w:rPr>
+          <w:color w:val="888888"/>
           <w:sz w:val="20"/>
         </w:rPr>
-        <w:t>Subtitle</w:t>
+        <w:t>Trimmed version (80 chars):</w:t>
+      </w:r>
+    </w:p>
+    <w:p>
+      <w:r>
+        <w:rPr>
+          <w:b/>
+          <w:sz w:val="22"/>
+        </w:rPr>
+        <w:t xml:space="preserve">Text: </w:t>
+      </w:r>
+      <w:r>
+        <w:rPr>
+          <w:sz w:val="22"/>
+        </w:rPr>
+        <w:t>A book on the Self with audio narration in 35 languages. Fully offline.</w:t>
+      </w:r>
+      <w:r>
+        <w:rPr>
+          <w:color w:val="888888"/>
+          <w:sz w:val="18"/>
+        </w:rPr>
+        <w:t xml:space="preserve">  (71 of 80 chars)</w:t>
       </w:r>
     </w:p>
     <w:p>
       <w:pPr>
-        <w:spacing w:after="40"/>
+        <w:pStyle w:val="Heading3"/>
       </w:pPr>
       <w:r>
-        <w:rPr>
-          <w:rFonts w:ascii="Arial" w:hAnsi="Arial"/>
-          <w:b/>
-          <w:sz w:val="20"/>
-        </w:rPr>
-        <w:t xml:space="preserve">Text:  </w:t>
-      </w:r>
-      <w:r>
-        <w:rPr>
-          <w:rFonts w:ascii="Arial" w:hAnsi="Arial"/>
-          <w:sz w:val="20"/>
-        </w:rPr>
-        <w:t>A Book on the Nature of the Self</w:t>
-      </w:r>
-      <w:r>
-        <w:rPr>
-          <w:rFonts w:ascii="Arial" w:hAnsi="Arial"/>
-          <w:color w:val="887766"/>
-          <w:sz w:val="18"/>
-        </w:rPr>
-        <w:t xml:space="preserve">  (30 chars max — 32 used — trim if needed)</w:t>
-      </w:r>
-    </w:p>
-    <w:p>
-      <w:pPr>
-        <w:spacing w:after="80"/>
-      </w:pPr>
-      <w:r>
-        <w:rPr>
-          <w:rFonts w:ascii="Arial" w:hAnsi="Arial"/>
-          <w:b w:val="0"/>
-          <w:i/>
-          <w:color w:val="887766"/>
-          <w:sz w:val="20"/>
-        </w:rPr>
-        <w:t>Alternatives if too long:</w:t>
-      </w:r>
-    </w:p>
-    <w:p>
-      <w:pPr>
-        <w:spacing w:after="80"/>
-      </w:pPr>
-      <w:r>
-        <w:rPr>
-          <w:rFonts w:ascii="Arial" w:hAnsi="Arial"/>
-          <w:b w:val="0"/>
-          <w:i w:val="0"/>
-          <w:sz w:val="20"/>
-        </w:rPr>
-        <w:t xml:space="preserve">  · Vedanta · 35 Languages</w:t>
-      </w:r>
-    </w:p>
-    <w:p>
-      <w:pPr>
-        <w:spacing w:after="80"/>
-      </w:pPr>
-      <w:r>
-        <w:rPr>
-          <w:rFonts w:ascii="Arial" w:hAnsi="Arial"/>
-          <w:b w:val="0"/>
-          <w:i w:val="0"/>
-          <w:sz w:val="20"/>
-        </w:rPr>
-        <w:t xml:space="preserve">  · The Self, in 35 Languages</w:t>
-      </w:r>
-    </w:p>
-    <w:p>
-      <w:pPr>
-        <w:spacing w:before="200" w:after="80"/>
-      </w:pPr>
-      <w:r>
-        <w:rPr>
-          <w:rFonts w:ascii="Arial" w:hAnsi="Arial"/>
-          <w:b/>
-          <w:color w:val="C9952A"/>
-          <w:sz w:val="20"/>
-        </w:rPr>
         <w:t>Category</w:t>
       </w:r>
     </w:p>
     <w:p>
-      <w:pPr>
-        <w:spacing w:after="40"/>
-      </w:pPr>
       <w:r>
         <w:rPr>
-          <w:rFonts w:ascii="Arial" w:hAnsi="Arial"/>
           <w:b/>
-          <w:sz w:val="20"/>
+          <w:sz w:val="22"/>
         </w:rPr>
-        <w:t xml:space="preserve">Primary:  </w:t>
+        <w:t xml:space="preserve">Primary: </w:t>
       </w:r>
       <w:r>
         <w:rPr>
-          <w:rFonts w:ascii="Arial" w:hAnsi="Arial"/>
-          <w:sz w:val="20"/>
-        </w:rPr>
-        <w:t>Books</w:t>
-      </w:r>
-    </w:p>
-    <w:p>
-      <w:pPr>
-        <w:spacing w:after="40"/>
-      </w:pPr>
-      <w:r>
-        <w:rPr>
-          <w:rFonts w:ascii="Arial" w:hAnsi="Arial"/>
-          <w:b/>
-          <w:sz w:val="20"/>
-        </w:rPr>
-        <w:t xml:space="preserve">Secondary:  </w:t>
-      </w:r>
-      <w:r>
-        <w:rPr>
-          <w:rFonts w:ascii="Arial" w:hAnsi="Arial"/>
-          <w:sz w:val="20"/>
-        </w:rPr>
-        <w:t>Education</w:t>
-      </w:r>
-    </w:p>
-    <w:p>
-      <w:pPr>
-        <w:spacing w:before="200" w:after="80"/>
-      </w:pPr>
-      <w:r>
-        <w:rPr>
-          <w:rFonts w:ascii="Arial" w:hAnsi="Arial"/>
-          <w:b/>
-          <w:color w:val="C9952A"/>
-          <w:sz w:val="20"/>
-        </w:rPr>
-        <w:t>Description</w:t>
-      </w:r>
-    </w:p>
-    <w:p>
-      <w:pPr>
-        <w:spacing w:after="80"/>
-      </w:pPr>
-      <w:r>
-        <w:rPr>
-          <w:rFonts w:ascii="Arial" w:hAnsi="Arial"/>
-          <w:b w:val="0"/>
-          <w:i w:val="0"/>
-          <w:sz w:val="20"/>
-        </w:rPr>
-        <w:t>4,000 characters max. Suggested text below (approx. 900 chars — room to expand).</w:t>
-      </w:r>
-    </w:p>
-    <w:p/>
-    <w:p>
-      <w:pPr>
-        <w:spacing w:after="160"/>
-        <w:ind w:left="432" w:right="432"/>
-      </w:pPr>
-      <w:r>
-        <w:rPr>
-          <w:rFonts w:ascii="Arial" w:hAnsi="Arial"/>
-          <w:sz w:val="20"/>
-        </w:rPr>
-        <w:t>Jugalbandhi Self is a beautifully crafted digital edition of Rahil Mundkur's philosophical exploration of the nature of the Self — drawing on the ancient wisdom of Vedanta and Advaita philosophy.</w:t>
-        <w:br/>
-        <w:br/>
-        <w:t>The word jugalbandhi describes a duet in Indian classical music: two voices, one resonance. This book brings the perennial question "Who am I?" into conversation with the modern mind.</w:t>
-        <w:br/>
-        <w:br/>
-        <w:t>· Read the full text in 35 languages, including Sanskrit, Hindi, Tamil, Telugu, Arabic, Japanese, Chinese, and more</w:t>
-        <w:br/>
-        <w:t>· Fully offline — all translations embedded, no internet required</w:t>
-        <w:br/>
-        <w:t>· Bookmarks and personal notes for each chapter</w:t>
-        <w:br/>
-        <w:t>· Full-text search across the book</w:t>
-        <w:br/>
-        <w:t>· Adjustable font size and dark mode</w:t>
-        <w:br/>
-        <w:t>· Pinch to zoom for font control</w:t>
-        <w:br/>
-        <w:br/>
-        <w:t>Whether you approach this book through philosophy, spirituality, or simple curiosity, Jugalbandhi Self invites you to look inward.</w:t>
-      </w:r>
-    </w:p>
-    <w:p>
-      <w:pPr>
-        <w:spacing w:before="200" w:after="80"/>
-      </w:pPr>
-      <w:r>
-        <w:rPr>
-          <w:rFonts w:ascii="Arial" w:hAnsi="Arial"/>
-          <w:b/>
-          <w:color w:val="C9952A"/>
-          <w:sz w:val="20"/>
-        </w:rPr>
-        <w:t>Keywords</w:t>
-      </w:r>
-    </w:p>
-    <w:p>
-      <w:pPr>
-        <w:spacing w:after="80"/>
-      </w:pPr>
-      <w:r>
-        <w:rPr>
-          <w:rFonts w:ascii="Arial" w:hAnsi="Arial"/>
-          <w:b w:val="0"/>
-          <w:i/>
-          <w:color w:val="887766"/>
-          <w:sz w:val="20"/>
-        </w:rPr>
-        <w:t>100 characters max. Do not repeat words already in the title or subtitle.</w:t>
-      </w:r>
-    </w:p>
-    <w:p>
-      <w:pPr>
-        <w:spacing w:after="40"/>
-      </w:pPr>
-      <w:r>
-        <w:rPr>
-          <w:rFonts w:ascii="Arial" w:hAnsi="Arial"/>
-          <w:b/>
-          <w:sz w:val="20"/>
-        </w:rPr>
-        <w:t xml:space="preserve">Text:  </w:t>
-      </w:r>
-      <w:r>
-        <w:rPr>
-          <w:rFonts w:ascii="Arial" w:hAnsi="Arial"/>
-          <w:sz w:val="20"/>
-        </w:rPr>
-        <w:t>vedanta,self,consciousness,philosophy,advaita,non-duality,spirituality,meditation,Sanskrit,mindfulness</w:t>
-      </w:r>
-      <w:r>
-        <w:rPr>
-          <w:rFonts w:ascii="Arial" w:hAnsi="Arial"/>
-          <w:color w:val="887766"/>
-          <w:sz w:val="18"/>
-        </w:rPr>
-        <w:t xml:space="preserve">  (99 chars)</w:t>
-      </w:r>
-    </w:p>
-    <w:p>
-      <w:pPr>
-        <w:spacing w:before="200" w:after="80"/>
-      </w:pPr>
-      <w:r>
-        <w:rPr>
-          <w:rFonts w:ascii="Arial" w:hAnsi="Arial"/>
-          <w:b/>
-          <w:color w:val="C9952A"/>
-          <w:sz w:val="20"/>
-        </w:rPr>
-        <w:t>Support URL</w:t>
-      </w:r>
-    </w:p>
-    <w:p>
-      <w:pPr>
-        <w:spacing w:after="40"/>
-      </w:pPr>
-      <w:r>
-        <w:rPr>
-          <w:rFonts w:ascii="Arial" w:hAnsi="Arial"/>
-          <w:b/>
-          <w:sz w:val="20"/>
-        </w:rPr>
-        <w:t xml:space="preserve">Text:  </w:t>
-      </w:r>
-      <w:r>
-        <w:rPr>
-          <w:rFonts w:ascii="Arial" w:hAnsi="Arial"/>
-          <w:sz w:val="20"/>
-        </w:rPr>
-        <w:t>https://rahilsydney@gmail.com</w:t>
-      </w:r>
-      <w:r>
-        <w:rPr>
-          <w:rFonts w:ascii="Arial" w:hAnsi="Arial"/>
-          <w:color w:val="887766"/>
-          <w:sz w:val="18"/>
-        </w:rPr>
-        <w:t xml:space="preserve">  (Replace with a hosted support page or simple contact page)</w:t>
-      </w:r>
-    </w:p>
-    <w:p>
-      <w:pPr>
-        <w:spacing w:before="200" w:after="80"/>
-      </w:pPr>
-      <w:r>
-        <w:rPr>
-          <w:rFonts w:ascii="Arial" w:hAnsi="Arial"/>
-          <w:b/>
-          <w:color w:val="C9952A"/>
-          <w:sz w:val="20"/>
-        </w:rPr>
-        <w:t>Privacy Policy URL</w:t>
-      </w:r>
-    </w:p>
-    <w:p>
-      <w:pPr>
-        <w:spacing w:after="40"/>
-      </w:pPr>
-      <w:r>
-        <w:rPr>
-          <w:rFonts w:ascii="Arial" w:hAnsi="Arial"/>
-          <w:b/>
-          <w:sz w:val="20"/>
-        </w:rPr>
-        <w:t xml:space="preserve">Text:  </w:t>
-      </w:r>
-      <w:r>
-        <w:rPr>
-          <w:rFonts w:ascii="Arial" w:hAnsi="Arial"/>
-          <w:sz w:val="20"/>
-        </w:rPr>
-        <w:t>https://[your-domain]/privacy-policy.html</w:t>
-      </w:r>
-      <w:r>
-        <w:rPr>
-          <w:rFonts w:ascii="Arial" w:hAnsi="Arial"/>
-          <w:color w:val="887766"/>
-          <w:sz w:val="18"/>
-        </w:rPr>
-        <w:t xml:space="preserve">  (Host the provided privacy-policy.html file at this URL)</w:t>
-      </w:r>
-    </w:p>
-    <w:p>
-      <w:pPr>
-        <w:spacing w:before="200" w:after="80"/>
-      </w:pPr>
-      <w:r>
-        <w:rPr>
-          <w:rFonts w:ascii="Arial" w:hAnsi="Arial"/>
-          <w:b/>
-          <w:color w:val="C9952A"/>
-          <w:sz w:val="20"/>
-        </w:rPr>
-        <w:t>Age Rating</w:t>
-      </w:r>
-    </w:p>
-    <w:p>
-      <w:pPr>
-        <w:spacing w:after="40"/>
-      </w:pPr>
-      <w:r>
-        <w:rPr>
-          <w:rFonts w:ascii="Arial" w:hAnsi="Arial"/>
-          <w:b/>
-          <w:sz w:val="20"/>
-        </w:rPr>
-        <w:t xml:space="preserve">Rating:  </w:t>
-      </w:r>
-      <w:r>
-        <w:rPr>
-          <w:rFonts w:ascii="Arial" w:hAnsi="Arial"/>
-          <w:sz w:val="20"/>
-        </w:rPr>
-        <w:t>4+</w:t>
-      </w:r>
-      <w:r>
-        <w:rPr>
-          <w:rFonts w:ascii="Arial" w:hAnsi="Arial"/>
-          <w:color w:val="887766"/>
-          <w:sz w:val="18"/>
-        </w:rPr>
-        <w:t xml:space="preserve">  (No objectionable content)</w:t>
-      </w:r>
-    </w:p>
-    <w:p>
-      <w:pPr>
-        <w:spacing w:before="200" w:after="80"/>
-      </w:pPr>
-      <w:r>
-        <w:rPr>
-          <w:rFonts w:ascii="Arial" w:hAnsi="Arial"/>
-          <w:b/>
-          <w:color w:val="C9952A"/>
-          <w:sz w:val="20"/>
-        </w:rPr>
-        <w:t>What's New (Version 1.0)</w:t>
-      </w:r>
-    </w:p>
-    <w:p>
-      <w:pPr>
-        <w:spacing w:after="40"/>
-      </w:pPr>
-      <w:r>
-        <w:rPr>
-          <w:rFonts w:ascii="Arial" w:hAnsi="Arial"/>
-          <w:b/>
-          <w:sz w:val="20"/>
-        </w:rPr>
-        <w:t xml:space="preserve">Text:  </w:t>
-      </w:r>
-      <w:r>
-        <w:rPr>
-          <w:rFonts w:ascii="Arial" w:hAnsi="Arial"/>
-          <w:sz w:val="20"/>
-        </w:rPr>
-        <w:t>First release.</w:t>
-      </w:r>
-    </w:p>
-    <w:p>
-      <w:pPr>
-        <w:spacing w:before="120" w:after="120"/>
-        <w:pBdr>
-          <w:bottom w:val="single" w:sz="4" w:space="1" w:color="E8E0D0"/>
-        </w:pBdr>
-      </w:pPr>
-    </w:p>
-    <w:p>
-      <w:r>
-        <w:br w:type="page"/>
-      </w:r>
-    </w:p>
-    <w:p>
-      <w:pPr>
-        <w:spacing w:before="360" w:after="80"/>
-      </w:pPr>
-      <w:r>
-        <w:rPr>
-          <w:rFonts w:ascii="Arial" w:hAnsi="Arial"/>
-          <w:b/>
-          <w:color w:val="1A1008"/>
-          <w:sz w:val="28"/>
-        </w:rPr>
-        <w:t>Google Play Store</w:t>
-      </w:r>
-    </w:p>
-    <w:p>
-      <w:pPr>
-        <w:spacing w:after="80"/>
-      </w:pPr>
-      <w:r>
-        <w:rPr>
-          <w:rFonts w:ascii="Arial" w:hAnsi="Arial"/>
-          <w:b w:val="0"/>
-          <w:i/>
-          <w:color w:val="887766"/>
-          <w:sz w:val="20"/>
-        </w:rPr>
-        <w:t>Character limits are enforced by the Play Console.</w:t>
-      </w:r>
-    </w:p>
-    <w:p>
-      <w:pPr>
-        <w:spacing w:before="120" w:after="120"/>
-        <w:pBdr>
-          <w:bottom w:val="single" w:sz="4" w:space="1" w:color="E8E0D0"/>
-        </w:pBdr>
-      </w:pPr>
-    </w:p>
-    <w:p>
-      <w:pPr>
-        <w:spacing w:before="200" w:after="80"/>
-      </w:pPr>
-      <w:r>
-        <w:rPr>
-          <w:rFonts w:ascii="Arial" w:hAnsi="Arial"/>
-          <w:b/>
-          <w:color w:val="C9952A"/>
-          <w:sz w:val="20"/>
-        </w:rPr>
-        <w:t>App Name</w:t>
-      </w:r>
-    </w:p>
-    <w:p>
-      <w:pPr>
-        <w:spacing w:after="40"/>
-      </w:pPr>
-      <w:r>
-        <w:rPr>
-          <w:rFonts w:ascii="Arial" w:hAnsi="Arial"/>
-          <w:b/>
-          <w:sz w:val="20"/>
-        </w:rPr>
-        <w:t xml:space="preserve">Text:  </w:t>
-      </w:r>
-      <w:r>
-        <w:rPr>
-          <w:rFonts w:ascii="Arial" w:hAnsi="Arial"/>
-          <w:sz w:val="20"/>
-        </w:rPr>
-        <w:t>Jugalbandhi Self</w:t>
-      </w:r>
-      <w:r>
-        <w:rPr>
-          <w:rFonts w:ascii="Arial" w:hAnsi="Arial"/>
-          <w:color w:val="887766"/>
-          <w:sz w:val="18"/>
-        </w:rPr>
-        <w:t xml:space="preserve">  (50 chars max — 16 used)</w:t>
-      </w:r>
-    </w:p>
-    <w:p>
-      <w:pPr>
-        <w:spacing w:before="200" w:after="80"/>
-      </w:pPr>
-      <w:r>
-        <w:rPr>
-          <w:rFonts w:ascii="Arial" w:hAnsi="Arial"/>
-          <w:b/>
-          <w:color w:val="C9952A"/>
-          <w:sz w:val="20"/>
-        </w:rPr>
-        <w:t>Short Description</w:t>
-      </w:r>
-    </w:p>
-    <w:p>
-      <w:pPr>
-        <w:spacing w:after="40"/>
-      </w:pPr>
-      <w:r>
-        <w:rPr>
-          <w:rFonts w:ascii="Arial" w:hAnsi="Arial"/>
-          <w:b/>
-          <w:sz w:val="20"/>
-        </w:rPr>
-        <w:t xml:space="preserve">Text:  </w:t>
-      </w:r>
-      <w:r>
-        <w:rPr>
-          <w:rFonts w:ascii="Arial" w:hAnsi="Arial"/>
-          <w:sz w:val="20"/>
-        </w:rPr>
-        <w:t>A philosophical book on the Self, available in 35 languages — fully offline.</w:t>
-      </w:r>
-      <w:r>
-        <w:rPr>
-          <w:rFonts w:ascii="Arial" w:hAnsi="Arial"/>
-          <w:color w:val="887766"/>
-          <w:sz w:val="18"/>
-        </w:rPr>
-        <w:t xml:space="preserve">  (80 chars max — 76 used)</w:t>
-      </w:r>
-    </w:p>
-    <w:p>
-      <w:pPr>
-        <w:spacing w:before="200" w:after="80"/>
-      </w:pPr>
-      <w:r>
-        <w:rPr>
-          <w:rFonts w:ascii="Arial" w:hAnsi="Arial"/>
-          <w:b/>
-          <w:color w:val="C9952A"/>
-          <w:sz w:val="20"/>
-        </w:rPr>
-        <w:t>Category</w:t>
-      </w:r>
-    </w:p>
-    <w:p>
-      <w:pPr>
-        <w:spacing w:after="40"/>
-      </w:pPr>
-      <w:r>
-        <w:rPr>
-          <w:rFonts w:ascii="Arial" w:hAnsi="Arial"/>
-          <w:b/>
-          <w:sz w:val="20"/>
-        </w:rPr>
-        <w:t xml:space="preserve">Primary:  </w:t>
-      </w:r>
-      <w:r>
-        <w:rPr>
-          <w:rFonts w:ascii="Arial" w:hAnsi="Arial"/>
-          <w:sz w:val="20"/>
+          <w:sz w:val="22"/>
         </w:rPr>
         <w:t>Books &amp; Reference</w:t>
       </w:r>
     </w:p>
     <w:p>
       <w:pPr>
-        <w:spacing w:before="200" w:after="80"/>
+        <w:pStyle w:val="Heading3"/>
       </w:pPr>
       <w:r>
+        <w:t>Price</w:t>
+      </w:r>
+    </w:p>
+    <w:p>
+      <w:r>
         <w:rPr>
-          <w:rFonts w:ascii="Arial" w:hAnsi="Arial"/>
           <w:b/>
-          <w:color w:val="C9952A"/>
-          <w:sz w:val="20"/>
+          <w:sz w:val="22"/>
         </w:rPr>
+        <w:t xml:space="preserve">Price: </w:t>
+      </w:r>
+      <w:r>
+        <w:rPr>
+          <w:sz w:val="22"/>
+        </w:rPr>
+        <w:t>$6.99 USD</w:t>
+      </w:r>
+      <w:r>
+        <w:rPr>
+          <w:color w:val="888888"/>
+          <w:sz w:val="18"/>
+        </w:rPr>
+        <w:t xml:space="preserve">  (Set in Play Console &gt; Monetization &gt; Pricing)</w:t>
+      </w:r>
+    </w:p>
+    <w:p>
+      <w:pPr>
+        <w:pStyle w:val="Heading3"/>
+      </w:pPr>
+      <w:r>
         <w:t>Full Description</w:t>
       </w:r>
     </w:p>
     <w:p>
+      <w:r>
+        <w:rPr>
+          <w:color w:val="888888"/>
+          <w:sz w:val="20"/>
+        </w:rPr>
+        <w:t>4,000 characters max. Copy the text below:</w:t>
+      </w:r>
+    </w:p>
+    <w:p>
       <w:pPr>
-        <w:spacing w:after="80"/>
+        <w:ind w:left="432"/>
+        <w:shd w:val="clear" w:color="auto" w:fill="F5F5F0"/>
       </w:pPr>
       <w:r>
         <w:rPr>
-          <w:rFonts w:ascii="Arial" w:hAnsi="Arial"/>
-          <w:b w:val="0"/>
-          <w:i/>
-          <w:color w:val="887766"/>
-          <w:sz w:val="20"/>
-        </w:rPr>
-        <w:t>4,000 characters max. Can reuse Apple description — Play Store has no subtitle field so lead with more context.</w:t>
-      </w:r>
-    </w:p>
-    <w:p/>
-    <w:p>
-      <w:pPr>
-        <w:spacing w:after="160"/>
-        <w:ind w:left="432" w:right="432"/>
-      </w:pPr>
-      <w:r>
-        <w:rPr>
-          <w:rFonts w:ascii="Arial" w:hAnsi="Arial"/>
+          <w:color w:val="222222"/>
           <w:sz w:val="20"/>
         </w:rPr>
         <w:t>Jugalbandhi Self is a beautifully crafted digital edition of Rahil Mundkur's philosophical exploration of the nature of the Self — drawing on the ancient wisdom of Vedanta and Advaita philosophy.</w:t>
@@ -764,15 +585,19 @@
         <w:br/>
         <w:t>· Read the full text in 35 languages — Sanskrit, Hindi, Tamil, Telugu, Gujarati, Marathi, Bengali, Malayalam, Punjabi, Nepali, Arabic, Persian, Urdu, Hebrew, Thai, Burmese, Vietnamese, Japanese, Chinese (Simplified &amp; Traditional), Korean, Russian, Ukrainian, Greek, Spanish, French, German, Italian, Portuguese, Dutch, Polish, Swedish, Turkish, Indonesian, and Konkani</w:t>
         <w:br/>
-        <w:t>· Fully offline — all translations embedded, no internet required</w:t>
+        <w:t>· Listen to the book with built-in audio narration in English, Hindi, and French</w:t>
+        <w:br/>
+        <w:t>· Fully offline — all translations and audio embedded, no internet required</w:t>
+        <w:br/>
+        <w:t>· Side-by-side bilingual reading mode</w:t>
         <w:br/>
         <w:t>· Bookmarks and personal notes for each chapter</w:t>
         <w:br/>
         <w:t>· Full-text search across the entire book</w:t>
         <w:br/>
-        <w:t>· Adjustable font size and dark mode</w:t>
+        <w:t>· Adjustable font size, dark mode, and pinch-to-zoom</w:t>
         <w:br/>
-        <w:t>· Pinch-to-zoom font control</w:t>
+        <w:t>· 32 chapters across 1 hr 28 min of reading</w:t>
         <w:br/>
         <w:br/>
         <w:t>Whether you approach this book through philosophy, spirituality, or simple curiosity, Jugalbandhi Self invites you to look inward.</w:t>
@@ -783,41 +608,29 @@
     </w:p>
     <w:p>
       <w:pPr>
-        <w:spacing w:before="200" w:after="80"/>
+        <w:pStyle w:val="Heading3"/>
       </w:pPr>
       <w:r>
-        <w:rPr>
-          <w:rFonts w:ascii="Arial" w:hAnsi="Arial"/>
-          <w:b/>
-          <w:color w:val="C9952A"/>
-          <w:sz w:val="20"/>
-        </w:rPr>
         <w:t>Content Rating</w:t>
       </w:r>
     </w:p>
     <w:p>
-      <w:pPr>
-        <w:spacing w:after="40"/>
-      </w:pPr>
       <w:r>
         <w:rPr>
-          <w:rFonts w:ascii="Arial" w:hAnsi="Arial"/>
           <w:b/>
-          <w:sz w:val="20"/>
+          <w:sz w:val="22"/>
         </w:rPr>
-        <w:t xml:space="preserve">Rating:  </w:t>
+        <w:t xml:space="preserve">Rating: </w:t>
       </w:r>
       <w:r>
         <w:rPr>
-          <w:rFonts w:ascii="Arial" w:hAnsi="Arial"/>
-          <w:sz w:val="20"/>
+          <w:sz w:val="22"/>
         </w:rPr>
         <w:t>Everyone</w:t>
       </w:r>
       <w:r>
         <w:rPr>
-          <w:rFonts w:ascii="Arial" w:hAnsi="Arial"/>
-          <w:color w:val="887766"/>
+          <w:color w:val="888888"/>
           <w:sz w:val="18"/>
         </w:rPr>
         <w:t xml:space="preserve">  (Complete the Play Console questionnaire — no violence, no mature content)</w:t>
@@ -825,95 +638,79 @@
     </w:p>
     <w:p>
       <w:pPr>
-        <w:spacing w:before="200" w:after="80"/>
+        <w:pStyle w:val="Heading3"/>
       </w:pPr>
       <w:r>
-        <w:rPr>
-          <w:rFonts w:ascii="Arial" w:hAnsi="Arial"/>
-          <w:b/>
-          <w:color w:val="C9952A"/>
-          <w:sz w:val="20"/>
-        </w:rPr>
         <w:t>Privacy Policy URL</w:t>
       </w:r>
     </w:p>
     <w:p>
-      <w:pPr>
-        <w:spacing w:after="40"/>
-      </w:pPr>
       <w:r>
         <w:rPr>
-          <w:rFonts w:ascii="Arial" w:hAnsi="Arial"/>
           <w:b/>
-          <w:sz w:val="20"/>
+          <w:sz w:val="22"/>
         </w:rPr>
-        <w:t xml:space="preserve">Text:  </w:t>
+        <w:t xml:space="preserve">Text: </w:t>
       </w:r>
       <w:r>
         <w:rPr>
-          <w:rFonts w:ascii="Arial" w:hAnsi="Arial"/>
-          <w:sz w:val="20"/>
+          <w:sz w:val="22"/>
         </w:rPr>
-        <w:t>https://[your-domain]/privacy-policy.html</w:t>
-      </w:r>
-      <w:r>
-        <w:rPr>
-          <w:rFonts w:ascii="Arial" w:hAnsi="Arial"/>
-          <w:color w:val="887766"/>
-          <w:sz w:val="18"/>
-        </w:rPr>
-        <w:t xml:space="preserve">  (Same URL as Apple — host the provided privacy-policy.html)</w:t>
+        <w:t>https://rahilmundkur.github.io/jugalbandhi-self/privacy-policy.html</w:t>
       </w:r>
     </w:p>
     <w:p>
       <w:pPr>
-        <w:spacing w:before="200" w:after="80"/>
+        <w:pStyle w:val="Heading3"/>
       </w:pPr>
       <w:r>
+        <w:t>Contact Email</w:t>
+      </w:r>
+    </w:p>
+    <w:p>
+      <w:r>
         <w:rPr>
-          <w:rFonts w:ascii="Arial" w:hAnsi="Arial"/>
           <w:b/>
-          <w:color w:val="C9952A"/>
-          <w:sz w:val="20"/>
+          <w:sz w:val="22"/>
         </w:rPr>
+        <w:t xml:space="preserve">Text: </w:t>
+      </w:r>
+      <w:r>
+        <w:rPr>
+          <w:sz w:val="22"/>
+        </w:rPr>
+        <w:t>rahilsydney@gmail.com</w:t>
+      </w:r>
+      <w:r>
+        <w:rPr>
+          <w:color w:val="888888"/>
+          <w:sz w:val="18"/>
+        </w:rPr>
+        <w:t xml:space="preserve">  (Shown publicly on your store listing)</w:t>
+      </w:r>
+    </w:p>
+    <w:p>
+      <w:pPr>
+        <w:pStyle w:val="Heading3"/>
+      </w:pPr>
+      <w:r>
         <w:t>App Category Tags</w:t>
       </w:r>
     </w:p>
     <w:p>
-      <w:pPr>
-        <w:spacing w:after="80"/>
-      </w:pPr>
       <w:r>
         <w:rPr>
-          <w:rFonts w:ascii="Arial" w:hAnsi="Arial"/>
-          <w:b w:val="0"/>
-          <w:i w:val="0"/>
-          <w:sz w:val="20"/>
+          <w:b/>
+          <w:sz w:val="22"/>
         </w:rPr>
-        <w:t>Play Store allows you to add tags. Suggested:</w:t>
+        <w:t xml:space="preserve">Suggested: </w:t>
       </w:r>
-    </w:p>
-    <w:p>
-      <w:pPr>
-        <w:spacing w:after="80"/>
-      </w:pPr>
       <w:r>
         <w:rPr>
-          <w:rFonts w:ascii="Arial" w:hAnsi="Arial"/>
-          <w:b w:val="0"/>
-          <w:i w:val="0"/>
-          <w:sz w:val="20"/>
+          <w:sz w:val="22"/>
         </w:rPr>
-        <w:t xml:space="preserve">  · Philosophy  · Spirituality  · Books  · Education  · Self-Help</w:t>
+        <w:t>Philosophy, Spirituality, Books, Education, Self-Help</w:t>
       </w:r>
-    </w:p>
-    <w:p>
-      <w:pPr>
-        <w:spacing w:before="120" w:after="120"/>
-        <w:pBdr>
-          <w:bottom w:val="single" w:sz="4" w:space="1" w:color="E8E0D0"/>
-        </w:pBdr>
-      </w:pPr>
     </w:p>
     <w:p>
       <w:r>
@@ -922,332 +719,581 @@
     </w:p>
     <w:p>
       <w:pPr>
-        <w:spacing w:before="360" w:after="80"/>
+        <w:pStyle w:val="Heading1"/>
       </w:pPr>
       <w:r>
-        <w:rPr>
-          <w:rFonts w:ascii="Arial" w:hAnsi="Arial"/>
-          <w:b/>
-          <w:color w:val="1A1008"/>
-          <w:sz w:val="28"/>
-        </w:rPr>
-        <w:t>Screenshots Checklist</w:t>
+        <w:t>Google Play — Data Safety Responses</w:t>
       </w:r>
     </w:p>
     <w:p>
-      <w:pPr>
-        <w:spacing w:after="80"/>
-      </w:pPr>
       <w:r>
         <w:rPr>
-          <w:rFonts w:ascii="Arial" w:hAnsi="Arial"/>
-          <w:b w:val="0"/>
           <w:i/>
-          <w:color w:val="887766"/>
+          <w:color w:val="888888"/>
           <w:sz w:val="20"/>
         </w:rPr>
-        <w:t>Both stores require screenshots captured at specific dimensions. These cannot be simulated — use a real device or Xcode/Android Studio simulator.</w:t>
+        <w:t>Use these answers when completing the Data Safety form in Play Console.</w:t>
       </w:r>
     </w:p>
     <w:p>
-      <w:pPr>
-        <w:spacing w:before="120" w:after="120"/>
-        <w:pBdr>
-          <w:bottom w:val="single" w:sz="4" w:space="1" w:color="E8E0D0"/>
-        </w:pBdr>
-      </w:pPr>
-    </w:p>
-    <w:p>
-      <w:pPr>
-        <w:spacing w:before="200" w:after="80"/>
-      </w:pPr>
       <w:r>
         <w:rPr>
-          <w:rFonts w:ascii="Arial" w:hAnsi="Arial"/>
           <w:b/>
-          <w:color w:val="C9952A"/>
-          <w:sz w:val="20"/>
+          <w:sz w:val="22"/>
         </w:rPr>
-        <w:t>Apple (required device sizes)</w:t>
+        <w:t>Q: Does your app collect or share any of the required user data types?</w:t>
       </w:r>
     </w:p>
     <w:p>
-      <w:pPr>
-        <w:spacing w:after="80"/>
-      </w:pPr>
       <w:r>
         <w:rPr>
-          <w:rFonts w:ascii="Arial" w:hAnsi="Arial"/>
-          <w:b w:val="0"/>
-          <w:i w:val="0"/>
-          <w:sz w:val="20"/>
+          <w:color w:val="2A6EA8"/>
+          <w:sz w:val="22"/>
         </w:rPr>
-        <w:t>App Store Connect will reject submissions missing required sizes.</w:t>
+        <w:t>A: No — the app collects no personal or sensitive user data.</w:t>
+      </w:r>
+    </w:p>
+    <w:p/>
+    <w:p>
+      <w:r>
+        <w:rPr>
+          <w:b/>
+          <w:sz w:val="22"/>
+        </w:rPr>
+        <w:t>Q: Does your app collect any user data?</w:t>
       </w:r>
     </w:p>
     <w:p>
-      <w:pPr>
-        <w:spacing w:after="40"/>
-      </w:pPr>
       <w:r>
         <w:rPr>
-          <w:rFonts w:ascii="Arial" w:hAnsi="Arial"/>
-          <w:b/>
-          <w:sz w:val="20"/>
+          <w:color w:val="2A6EA8"/>
+          <w:sz w:val="22"/>
         </w:rPr>
-        <w:t xml:space="preserve">iPhone 6.9"  (iPhone 16 Pro Max):  </w:t>
+        <w:t>A: No. The app stores reading position, bookmarks, notes, and display preferences locally on the device only. This data never leaves the device.</w:t>
       </w:r>
+    </w:p>
+    <w:p/>
+    <w:p>
       <w:r>
         <w:rPr>
-          <w:rFonts w:ascii="Arial" w:hAnsi="Arial"/>
-          <w:sz w:val="20"/>
+          <w:b/>
+          <w:sz w:val="22"/>
         </w:rPr>
-        <w:t>1320 × 2868 px  — required</w:t>
+        <w:t>Q: Is all of the user data collected by your app encrypted in transit?</w:t>
       </w:r>
     </w:p>
     <w:p>
-      <w:pPr>
-        <w:spacing w:after="40"/>
-      </w:pPr>
       <w:r>
         <w:rPr>
-          <w:rFonts w:ascii="Arial" w:hAnsi="Arial"/>
-          <w:b/>
-          <w:sz w:val="20"/>
+          <w:color w:val="2A6EA8"/>
+          <w:sz w:val="22"/>
         </w:rPr>
-        <w:t xml:space="preserve">iPhone 6.5"  (iPhone 14 Plus etc.):  </w:t>
+        <w:t>A: N/A — no user data is transmitted. All content is embedded offline.</w:t>
       </w:r>
+    </w:p>
+    <w:p/>
+    <w:p>
       <w:r>
         <w:rPr>
-          <w:rFonts w:ascii="Arial" w:hAnsi="Arial"/>
-          <w:sz w:val="20"/>
+          <w:b/>
+          <w:sz w:val="22"/>
         </w:rPr>
-        <w:t>1284 × 2778 px  — required</w:t>
+        <w:t>Q: Do you provide a way for users to request that their data is deleted?</w:t>
       </w:r>
     </w:p>
     <w:p>
-      <w:pPr>
-        <w:spacing w:after="40"/>
-      </w:pPr>
       <w:r>
         <w:rPr>
-          <w:rFonts w:ascii="Arial" w:hAnsi="Arial"/>
-          <w:b/>
-          <w:sz w:val="20"/>
+          <w:color w:val="2A6EA8"/>
+          <w:sz w:val="22"/>
         </w:rPr>
-        <w:t xml:space="preserve">iPad 13"     (iPad Pro 13"):  </w:t>
+        <w:t>A: N/A — no user data is collected. Local data can be cleared by uninstalling the app.</w:t>
       </w:r>
+    </w:p>
+    <w:p/>
+    <w:p>
       <w:r>
         <w:rPr>
-          <w:rFonts w:ascii="Arial" w:hAnsi="Arial"/>
-          <w:sz w:val="20"/>
+          <w:b/>
+          <w:sz w:val="22"/>
         </w:rPr>
-        <w:t>2064 × 2752 px  — required if iPad supported</w:t>
+        <w:t>Q: Does your app share user data with third parties?</w:t>
       </w:r>
     </w:p>
     <w:p>
-      <w:pPr>
-        <w:spacing w:after="40"/>
-      </w:pPr>
       <w:r>
         <w:rPr>
-          <w:rFonts w:ascii="Arial" w:hAnsi="Arial"/>
-          <w:b/>
-          <w:sz w:val="20"/>
+          <w:color w:val="2A6EA8"/>
+          <w:sz w:val="22"/>
         </w:rPr>
-        <w:t xml:space="preserve">iPad 12.9"   (iPad Pro 12.9" 2nd gen):  </w:t>
+        <w:t>A: No.</w:t>
       </w:r>
+    </w:p>
+    <w:p/>
+    <w:p>
       <w:r>
         <w:rPr>
-          <w:rFonts w:ascii="Arial" w:hAnsi="Arial"/>
-          <w:sz w:val="20"/>
+          <w:b/>
+          <w:sz w:val="22"/>
         </w:rPr>
-        <w:t>2048 × 2732 px  — required if iPad supported</w:t>
+        <w:t>Q: Does your app use third-party libraries or SDKs that collect data?</w:t>
+      </w:r>
+    </w:p>
+    <w:p>
+      <w:r>
+        <w:rPr>
+          <w:color w:val="2A6EA8"/>
+          <w:sz w:val="22"/>
+        </w:rPr>
+        <w:t>A: No. The optional translation feature (MyMemory API) sends only text excerpts with no user identifiers, and only when explicitly triggered by the user.</w:t>
       </w:r>
     </w:p>
     <w:p/>
     <w:p>
       <w:pPr>
-        <w:spacing w:before="200" w:after="80"/>
+        <w:pStyle w:val="Heading1"/>
       </w:pPr>
       <w:r>
-        <w:rPr>
-          <w:rFonts w:ascii="Arial" w:hAnsi="Arial"/>
-          <w:b/>
-          <w:color w:val="C9952A"/>
-          <w:sz w:val="20"/>
-        </w:rPr>
-        <w:t>Google Play (required)</w:t>
+        <w:t>Assets Checklist</w:t>
       </w:r>
     </w:p>
-    <w:p>
-      <w:pPr>
-        <w:spacing w:after="40"/>
-      </w:pPr>
-      <w:r>
-        <w:rPr>
-          <w:rFonts w:ascii="Arial" w:hAnsi="Arial"/>
-          <w:b/>
-          <w:sz w:val="20"/>
-        </w:rPr>
-        <w:t xml:space="preserve">Phone:  </w:t>
-      </w:r>
-      <w:r>
-        <w:rPr>
-          <w:rFonts w:ascii="Arial" w:hAnsi="Arial"/>
-          <w:sz w:val="20"/>
-        </w:rPr>
-        <w:t>Min 320px, max 3840px on any side — portrait preferred</w:t>
-      </w:r>
-    </w:p>
-    <w:p>
-      <w:pPr>
-        <w:spacing w:after="40"/>
-      </w:pPr>
-      <w:r>
-        <w:rPr>
-          <w:rFonts w:ascii="Arial" w:hAnsi="Arial"/>
-          <w:b/>
-          <w:sz w:val="20"/>
-        </w:rPr>
-        <w:t xml:space="preserve">Feature Graphic:  </w:t>
-      </w:r>
-      <w:r>
-        <w:rPr>
-          <w:rFonts w:ascii="Arial" w:hAnsi="Arial"/>
-          <w:sz w:val="20"/>
-        </w:rPr>
-        <w:t>1024 × 500 px  — required for Play Store listing banner</w:t>
-      </w:r>
-    </w:p>
-    <w:p>
-      <w:pPr>
-        <w:spacing w:after="40"/>
-      </w:pPr>
-      <w:r>
-        <w:rPr>
-          <w:rFonts w:ascii="Arial" w:hAnsi="Arial"/>
-          <w:b/>
-          <w:sz w:val="20"/>
-        </w:rPr>
-        <w:t xml:space="preserve">7-inch tablet:  </w:t>
-      </w:r>
-      <w:r>
-        <w:rPr>
-          <w:rFonts w:ascii="Arial" w:hAnsi="Arial"/>
-          <w:sz w:val="20"/>
-        </w:rPr>
-        <w:t>Optional but recommended</w:t>
-      </w:r>
-    </w:p>
-    <w:p>
-      <w:pPr>
-        <w:spacing w:after="40"/>
-      </w:pPr>
-      <w:r>
-        <w:rPr>
-          <w:rFonts w:ascii="Arial" w:hAnsi="Arial"/>
-          <w:b/>
-          <w:sz w:val="20"/>
-        </w:rPr>
-        <w:t xml:space="preserve">10-inch tablet:  </w:t>
-      </w:r>
-      <w:r>
-        <w:rPr>
-          <w:rFonts w:ascii="Arial" w:hAnsi="Arial"/>
-          <w:sz w:val="20"/>
-        </w:rPr>
-        <w:t>Optional but recommended</w:t>
-      </w:r>
-    </w:p>
-    <w:p/>
-    <w:p>
-      <w:pPr>
-        <w:spacing w:before="200" w:after="80"/>
-      </w:pPr>
-      <w:r>
-        <w:rPr>
-          <w:rFonts w:ascii="Arial" w:hAnsi="Arial"/>
-          <w:b/>
-          <w:color w:val="C9952A"/>
-          <w:sz w:val="20"/>
-        </w:rPr>
-        <w:t>Suggested screenshot sequence (both stores)</w:t>
-      </w:r>
-    </w:p>
-    <w:p>
-      <w:pPr>
-        <w:spacing w:after="80"/>
-      </w:pPr>
-      <w:r>
-        <w:rPr>
-          <w:rFonts w:ascii="Arial" w:hAnsi="Arial"/>
-          <w:b w:val="0"/>
-          <w:i w:val="0"/>
-          <w:sz w:val="20"/>
-        </w:rPr>
-        <w:t xml:space="preserve">  1.  Cover / welcome screen — show the book title</w:t>
-      </w:r>
-    </w:p>
-    <w:p>
-      <w:pPr>
-        <w:spacing w:after="80"/>
-      </w:pPr>
-      <w:r>
-        <w:rPr>
-          <w:rFonts w:ascii="Arial" w:hAnsi="Arial"/>
-          <w:b w:val="0"/>
-          <w:i w:val="0"/>
-          <w:sz w:val="20"/>
-        </w:rPr>
-        <w:t xml:space="preserve">  2.  Chapter reading view — open to a striking passage</w:t>
-      </w:r>
-    </w:p>
-    <w:p>
-      <w:pPr>
-        <w:spacing w:after="80"/>
-      </w:pPr>
-      <w:r>
-        <w:rPr>
-          <w:rFonts w:ascii="Arial" w:hAnsi="Arial"/>
-          <w:b w:val="0"/>
-          <w:i w:val="0"/>
-          <w:sz w:val="20"/>
-        </w:rPr>
-        <w:t xml:space="preserve">  3.  Dark mode reading view</w:t>
-      </w:r>
-    </w:p>
-    <w:p>
-      <w:pPr>
-        <w:spacing w:after="80"/>
-      </w:pPr>
-      <w:r>
-        <w:rPr>
-          <w:rFonts w:ascii="Arial" w:hAnsi="Arial"/>
-          <w:b w:val="0"/>
-          <w:i w:val="0"/>
-          <w:sz w:val="20"/>
-        </w:rPr>
-        <w:t xml:space="preserve">  4.  Language selector — showing all 35 languages</w:t>
-      </w:r>
-    </w:p>
-    <w:p>
-      <w:pPr>
-        <w:spacing w:after="80"/>
-      </w:pPr>
-      <w:r>
-        <w:rPr>
-          <w:rFonts w:ascii="Arial" w:hAnsi="Arial"/>
-          <w:b w:val="0"/>
-          <w:i w:val="0"/>
-          <w:sz w:val="20"/>
-        </w:rPr>
-        <w:t xml:space="preserve">  5.  Bookmarks or notes panel</w:t>
-      </w:r>
-    </w:p>
+    <w:tbl>
+      <w:tblPr>
+        <w:tblStyle w:val="TableGrid"/>
+        <w:tblW w:type="auto" w:w="0"/>
+        <w:tblLook w:firstColumn="1" w:firstRow="1" w:lastColumn="0" w:lastRow="0" w:noHBand="0" w:noVBand="1" w:val="04A0"/>
+      </w:tblPr>
+      <w:tblGrid>
+        <w:gridCol w:w="2880"/>
+        <w:gridCol w:w="2880"/>
+        <w:gridCol w:w="2880"/>
+      </w:tblGrid>
+      <w:tr>
+        <w:tc>
+          <w:tcPr>
+            <w:tcW w:type="dxa" w:w="2880"/>
+          </w:tcPr>
+          <w:p>
+            <w:r>
+              <w:rPr>
+                <w:b/>
+                <w:sz w:val="20"/>
+              </w:rPr>
+              <w:t>Asset</w:t>
+            </w:r>
+          </w:p>
+        </w:tc>
+        <w:tc>
+          <w:tcPr>
+            <w:tcW w:type="dxa" w:w="2880"/>
+          </w:tcPr>
+          <w:p>
+            <w:r>
+              <w:rPr>
+                <w:b/>
+                <w:sz w:val="20"/>
+              </w:rPr>
+              <w:t>Location</w:t>
+            </w:r>
+          </w:p>
+        </w:tc>
+        <w:tc>
+          <w:tcPr>
+            <w:tcW w:type="dxa" w:w="2880"/>
+          </w:tcPr>
+          <w:p>
+            <w:r>
+              <w:rPr>
+                <w:b/>
+                <w:sz w:val="20"/>
+              </w:rPr>
+              <w:t>Status</w:t>
+            </w:r>
+          </w:p>
+        </w:tc>
+      </w:tr>
+      <w:tr>
+        <w:tc>
+          <w:tcPr>
+            <w:tcW w:type="dxa" w:w="2880"/>
+          </w:tcPr>
+          <w:p>
+            <w:r>
+              <w:rPr>
+                <w:sz w:val="18"/>
+              </w:rPr>
+              <w:t>App icon (1024x1024 PNG)</w:t>
+            </w:r>
+          </w:p>
+        </w:tc>
+        <w:tc>
+          <w:tcPr>
+            <w:tcW w:type="dxa" w:w="2880"/>
+          </w:tcPr>
+          <w:p>
+            <w:r>
+              <w:rPr>
+                <w:sz w:val="18"/>
+              </w:rPr>
+              <w:t>icons/icon-1024.png</w:t>
+            </w:r>
+          </w:p>
+        </w:tc>
+        <w:tc>
+          <w:tcPr>
+            <w:tcW w:type="dxa" w:w="2880"/>
+          </w:tcPr>
+          <w:p>
+            <w:r>
+              <w:rPr>
+                <w:color w:val="339933"/>
+                <w:sz w:val="18"/>
+              </w:rPr>
+              <w:t>Done</w:t>
+            </w:r>
+          </w:p>
+        </w:tc>
+      </w:tr>
+      <w:tr>
+        <w:tc>
+          <w:tcPr>
+            <w:tcW w:type="dxa" w:w="2880"/>
+          </w:tcPr>
+          <w:p>
+            <w:r>
+              <w:rPr>
+                <w:sz w:val="18"/>
+              </w:rPr>
+              <w:t>App icon (512x512 PNG)</w:t>
+            </w:r>
+          </w:p>
+        </w:tc>
+        <w:tc>
+          <w:tcPr>
+            <w:tcW w:type="dxa" w:w="2880"/>
+          </w:tcPr>
+          <w:p>
+            <w:r>
+              <w:rPr>
+                <w:sz w:val="18"/>
+              </w:rPr>
+              <w:t>icons/icon-512.png</w:t>
+            </w:r>
+          </w:p>
+        </w:tc>
+        <w:tc>
+          <w:tcPr>
+            <w:tcW w:type="dxa" w:w="2880"/>
+          </w:tcPr>
+          <w:p>
+            <w:r>
+              <w:rPr>
+                <w:color w:val="339933"/>
+                <w:sz w:val="18"/>
+              </w:rPr>
+              <w:t>Done</w:t>
+            </w:r>
+          </w:p>
+        </w:tc>
+      </w:tr>
+      <w:tr>
+        <w:tc>
+          <w:tcPr>
+            <w:tcW w:type="dxa" w:w="2880"/>
+          </w:tcPr>
+          <w:p>
+            <w:r>
+              <w:rPr>
+                <w:sz w:val="18"/>
+              </w:rPr>
+              <w:t>Google Play Feature Graphic (1024x500)</w:t>
+            </w:r>
+          </w:p>
+        </w:tc>
+        <w:tc>
+          <w:tcPr>
+            <w:tcW w:type="dxa" w:w="2880"/>
+          </w:tcPr>
+          <w:p>
+            <w:r>
+              <w:rPr>
+                <w:sz w:val="18"/>
+              </w:rPr>
+              <w:t>icons/google-play-feature-graphic.jpg</w:t>
+            </w:r>
+          </w:p>
+        </w:tc>
+        <w:tc>
+          <w:tcPr>
+            <w:tcW w:type="dxa" w:w="2880"/>
+          </w:tcPr>
+          <w:p>
+            <w:r>
+              <w:rPr>
+                <w:color w:val="CC3333"/>
+                <w:sz w:val="18"/>
+              </w:rPr>
+              <w:t>NEEDS RECREATION</w:t>
+            </w:r>
+          </w:p>
+        </w:tc>
+      </w:tr>
+      <w:tr>
+        <w:tc>
+          <w:tcPr>
+            <w:tcW w:type="dxa" w:w="2880"/>
+          </w:tcPr>
+          <w:p>
+            <w:r>
+              <w:rPr>
+                <w:sz w:val="18"/>
+              </w:rPr>
+              <w:t>Phone screenshots (5)</w:t>
+            </w:r>
+          </w:p>
+        </w:tc>
+        <w:tc>
+          <w:tcPr>
+            <w:tcW w:type="dxa" w:w="2880"/>
+          </w:tcPr>
+          <w:p>
+            <w:r>
+              <w:rPr>
+                <w:sz w:val="18"/>
+              </w:rPr>
+              <w:t>icons/screenshot-phone-1 through 5.png</w:t>
+            </w:r>
+          </w:p>
+        </w:tc>
+        <w:tc>
+          <w:tcPr>
+            <w:tcW w:type="dxa" w:w="2880"/>
+          </w:tcPr>
+          <w:p>
+            <w:r>
+              <w:rPr>
+                <w:color w:val="339933"/>
+                <w:sz w:val="18"/>
+              </w:rPr>
+              <w:t>Done</w:t>
+            </w:r>
+          </w:p>
+        </w:tc>
+      </w:tr>
+      <w:tr>
+        <w:tc>
+          <w:tcPr>
+            <w:tcW w:type="dxa" w:w="2880"/>
+          </w:tcPr>
+          <w:p>
+            <w:r>
+              <w:rPr>
+                <w:sz w:val="18"/>
+              </w:rPr>
+              <w:t>Wide/desktop screenshot (1)</w:t>
+            </w:r>
+          </w:p>
+        </w:tc>
+        <w:tc>
+          <w:tcPr>
+            <w:tcW w:type="dxa" w:w="2880"/>
+          </w:tcPr>
+          <w:p>
+            <w:r>
+              <w:rPr>
+                <w:sz w:val="18"/>
+              </w:rPr>
+              <w:t>icons/screenshot-wide-1.png</w:t>
+            </w:r>
+          </w:p>
+        </w:tc>
+        <w:tc>
+          <w:tcPr>
+            <w:tcW w:type="dxa" w:w="2880"/>
+          </w:tcPr>
+          <w:p>
+            <w:r>
+              <w:rPr>
+                <w:color w:val="339933"/>
+                <w:sz w:val="18"/>
+              </w:rPr>
+              <w:t>Done</w:t>
+            </w:r>
+          </w:p>
+        </w:tc>
+      </w:tr>
+      <w:tr>
+        <w:tc>
+          <w:tcPr>
+            <w:tcW w:type="dxa" w:w="2880"/>
+          </w:tcPr>
+          <w:p>
+            <w:r>
+              <w:rPr>
+                <w:sz w:val="18"/>
+              </w:rPr>
+              <w:t>Privacy policy page</w:t>
+            </w:r>
+          </w:p>
+        </w:tc>
+        <w:tc>
+          <w:tcPr>
+            <w:tcW w:type="dxa" w:w="2880"/>
+          </w:tcPr>
+          <w:p>
+            <w:r>
+              <w:rPr>
+                <w:sz w:val="18"/>
+              </w:rPr>
+              <w:t>privacy-policy.html</w:t>
+            </w:r>
+          </w:p>
+        </w:tc>
+        <w:tc>
+          <w:tcPr>
+            <w:tcW w:type="dxa" w:w="2880"/>
+          </w:tcPr>
+          <w:p>
+            <w:r>
+              <w:rPr>
+                <w:color w:val="339933"/>
+                <w:sz w:val="18"/>
+              </w:rPr>
+              <w:t>Done — hosted on GitHub Pages</w:t>
+            </w:r>
+          </w:p>
+        </w:tc>
+      </w:tr>
+      <w:tr>
+        <w:tc>
+          <w:tcPr>
+            <w:tcW w:type="dxa" w:w="2880"/>
+          </w:tcPr>
+          <w:p>
+            <w:r>
+              <w:rPr>
+                <w:sz w:val="18"/>
+              </w:rPr>
+              <w:t>Digital Asset Links</w:t>
+            </w:r>
+          </w:p>
+        </w:tc>
+        <w:tc>
+          <w:tcPr>
+            <w:tcW w:type="dxa" w:w="2880"/>
+          </w:tcPr>
+          <w:p>
+            <w:r>
+              <w:rPr>
+                <w:sz w:val="18"/>
+              </w:rPr>
+              <w:t>.well-known/assetlinks.json</w:t>
+            </w:r>
+          </w:p>
+        </w:tc>
+        <w:tc>
+          <w:tcPr>
+            <w:tcW w:type="dxa" w:w="2880"/>
+          </w:tcPr>
+          <w:p>
+            <w:r>
+              <w:rPr>
+                <w:color w:val="339933"/>
+                <w:sz w:val="18"/>
+              </w:rPr>
+              <w:t>Done</w:t>
+            </w:r>
+          </w:p>
+        </w:tc>
+      </w:tr>
+      <w:tr>
+        <w:tc>
+          <w:tcPr>
+            <w:tcW w:type="dxa" w:w="2880"/>
+          </w:tcPr>
+          <w:p>
+            <w:r>
+              <w:rPr>
+                <w:sz w:val="18"/>
+              </w:rPr>
+              <w:t>Android App Bundle</w:t>
+            </w:r>
+          </w:p>
+        </w:tc>
+        <w:tc>
+          <w:tcPr>
+            <w:tcW w:type="dxa" w:w="2880"/>
+          </w:tcPr>
+          <w:p>
+            <w:r>
+              <w:rPr>
+                <w:sz w:val="18"/>
+              </w:rPr>
+              <w:t>~/jugalbandhi-twa/app-release-bundle.aab</w:t>
+            </w:r>
+          </w:p>
+        </w:tc>
+        <w:tc>
+          <w:tcPr>
+            <w:tcW w:type="dxa" w:w="2880"/>
+          </w:tcPr>
+          <w:p>
+            <w:r>
+              <w:rPr>
+                <w:color w:val="339933"/>
+                <w:sz w:val="18"/>
+              </w:rPr>
+              <w:t>Done</w:t>
+            </w:r>
+          </w:p>
+        </w:tc>
+      </w:tr>
+      <w:tr>
+        <w:tc>
+          <w:tcPr>
+            <w:tcW w:type="dxa" w:w="2880"/>
+          </w:tcPr>
+          <w:p>
+            <w:r>
+              <w:rPr>
+                <w:sz w:val="18"/>
+              </w:rPr>
+              <w:t>Signing keystore</w:t>
+            </w:r>
+          </w:p>
+        </w:tc>
+        <w:tc>
+          <w:tcPr>
+            <w:tcW w:type="dxa" w:w="2880"/>
+          </w:tcPr>
+          <w:p>
+            <w:r>
+              <w:rPr>
+                <w:sz w:val="18"/>
+              </w:rPr>
+              <w:t>~/jugalbandhi-twa/android.keystore</w:t>
+            </w:r>
+          </w:p>
+        </w:tc>
+        <w:tc>
+          <w:tcPr>
+            <w:tcW w:type="dxa" w:w="2880"/>
+          </w:tcPr>
+          <w:p>
+            <w:r>
+              <w:rPr>
+                <w:color w:val="339933"/>
+                <w:sz w:val="18"/>
+              </w:rPr>
+              <w:t>Done — BACK THIS UP</w:t>
+            </w:r>
+          </w:p>
+        </w:tc>
+      </w:tr>
+    </w:tbl>
     <w:sectPr>
-      <w:pgSz w:w="11906" w:h="16838"/>
-      <w:pgMar w:top="1417" w:right="1417" w:bottom="1417" w:left="1417" w:header="720" w:footer="720" w:gutter="0"/>
+      <w:pgSz w:w="12240" w:h="15840"/>
+      <w:pgMar w:top="1440" w:right="1800" w:bottom="1440" w:left="1800" w:header="720" w:footer="720" w:gutter="0"/>
       <w:cols w:space="720"/>
       <w:docGrid w:linePitch="360"/>
     </w:sectPr>
@@ -1620,7 +1666,8 @@
     <w:rsid w:val="00FC693F"/>
     <w:rPr>
       <w:rFonts w:ascii="Arial" w:hAnsi="Arial"/>
-      <w:sz w:val="20"/>
+      <w:color w:val="333333"/>
+      <w:sz w:val="22"/>
     </w:rPr>
   </w:style>
   <w:style w:type="paragraph" w:styleId="Header">
@@ -1682,11 +1729,11 @@
       <w:outlineLvl w:val="0"/>
     </w:pPr>
     <w:rPr>
-      <w:rFonts w:asciiTheme="majorHAnsi" w:eastAsiaTheme="majorEastAsia" w:hAnsiTheme="majorHAnsi" w:cstheme="majorBidi"/>
+      <w:rFonts w:asciiTheme="majorHAnsi" w:eastAsiaTheme="majorEastAsia" w:hAnsiTheme="majorHAnsi" w:cstheme="majorBidi" w:ascii="Arial" w:hAnsi="Arial"/>
       <w:b/>
       <w:bCs/>
-      <w:color w:val="365F91" w:themeColor="accent1" w:themeShade="BF"/>
-      <w:sz w:val="28"/>
+      <w:color w:val="1A568E"/>
+      <w:sz w:val="44"/>
       <w:szCs w:val="28"/>
     </w:rPr>
   </w:style>
@@ -1706,11 +1753,11 @@
       <w:outlineLvl w:val="1"/>
     </w:pPr>
     <w:rPr>
-      <w:rFonts w:asciiTheme="majorHAnsi" w:eastAsiaTheme="majorEastAsia" w:hAnsiTheme="majorHAnsi" w:cstheme="majorBidi"/>
+      <w:rFonts w:asciiTheme="majorHAnsi" w:eastAsiaTheme="majorEastAsia" w:hAnsiTheme="majorHAnsi" w:cstheme="majorBidi" w:ascii="Arial" w:hAnsi="Arial"/>
       <w:b/>
       <w:bCs/>
-      <w:color w:val="4F81BD" w:themeColor="accent1"/>
-      <w:sz w:val="26"/>
+      <w:color w:val="2A6EA8"/>
+      <w:sz w:val="32"/>
       <w:szCs w:val="26"/>
     </w:rPr>
   </w:style>
@@ -1730,10 +1777,11 @@
       <w:outlineLvl w:val="2"/>
     </w:pPr>
     <w:rPr>
-      <w:rFonts w:asciiTheme="majorHAnsi" w:eastAsiaTheme="majorEastAsia" w:hAnsiTheme="majorHAnsi" w:cstheme="majorBidi"/>
+      <w:rFonts w:asciiTheme="majorHAnsi" w:eastAsiaTheme="majorEastAsia" w:hAnsiTheme="majorHAnsi" w:cstheme="majorBidi" w:ascii="Arial" w:hAnsi="Arial"/>
       <w:b/>
       <w:bCs/>
-      <w:color w:val="4F81BD" w:themeColor="accent1"/>
+      <w:color w:val="3A7EB8"/>
+      <w:sz w:val="26"/>
     </w:rPr>
   </w:style>
   <w:style w:type="paragraph" w:styleId="Heading4">

</xml_diff>